<commit_message>
docs(requisitos): agrega delimitacion del MVP en la ERF v1.1
Nueva seccion 1.3 con las funcionalidades incluidas en el MVP (proyeccion de
demanda, analisis territorial, caracterizacion de hospitalizaciones,
visualizacion de resultados, API, trazabilidad) y las excluidas (gestion de
pacientes, cupos o camas en tiempo real, decisiones clinicas, prediccion de
riesgo individual, integracion en tiempo real, otras regiones), trazadas a
los RF y FA correspondientes. Renumera las secciones 1.4 a 1.6.
</commit_message>
<xml_diff>
--- a/docs/06-requisitos/Especificacion_Requisitos_Funcionales.docx
+++ b/docs/06-requisitos/Especificacion_Requisitos_Funcionales.docx
@@ -167,7 +167,7 @@
               <w:rPr>
                 <w:sz w:val="20"/>
               </w:rPr>
-              <w:t>1.0</w:t>
+              <w:t>1.1</w:t>
             </w:r>
           </w:p>
         </w:tc>
@@ -201,7 +201,7 @@
               <w:rPr>
                 <w:sz w:val="20"/>
               </w:rPr>
-              <w:t>10 de septiembre de 2026</w:t>
+              <w:t>28 de septiembre de 2026</w:t>
             </w:r>
           </w:p>
         </w:tc>
@@ -670,6 +670,72 @@
                 <w:sz w:val="19"/>
               </w:rPr>
               <w:t>Primera versión formal completa: catálogo de requisitos funcionales, historias de usuario, casos de uso, reglas de negocio, exclusiones y trazabilidad.</w:t>
+            </w:r>
+          </w:p>
+        </w:tc>
+      </w:tr>
+      <w:tr>
+        <w:tc>
+          <w:tcPr>
+            <w:tcW w:type="dxa" w:w="1134"/>
+          </w:tcPr>
+          <w:p>
+            <w:pPr>
+              <w:spacing w:before="40" w:after="40"/>
+            </w:pPr>
+            <w:r>
+              <w:rPr>
+                <w:sz w:val="19"/>
+              </w:rPr>
+              <w:t>1.1</w:t>
+            </w:r>
+          </w:p>
+        </w:tc>
+        <w:tc>
+          <w:tcPr>
+            <w:tcW w:type="dxa" w:w="1474"/>
+          </w:tcPr>
+          <w:p>
+            <w:pPr>
+              <w:spacing w:before="40" w:after="40"/>
+            </w:pPr>
+            <w:r>
+              <w:rPr>
+                <w:sz w:val="19"/>
+              </w:rPr>
+              <w:t>28-09-2026</w:t>
+            </w:r>
+          </w:p>
+        </w:tc>
+        <w:tc>
+          <w:tcPr>
+            <w:tcW w:type="dxa" w:w="2041"/>
+          </w:tcPr>
+          <w:p>
+            <w:pPr>
+              <w:spacing w:before="40" w:after="40"/>
+            </w:pPr>
+            <w:r>
+              <w:rPr>
+                <w:sz w:val="19"/>
+              </w:rPr>
+              <w:t>Equipo SAAD</w:t>
+            </w:r>
+          </w:p>
+        </w:tc>
+        <w:tc>
+          <w:tcPr>
+            <w:tcW w:type="dxa" w:w="5386"/>
+          </w:tcPr>
+          <w:p>
+            <w:pPr>
+              <w:spacing w:before="40" w:after="40"/>
+            </w:pPr>
+            <w:r>
+              <w:rPr>
+                <w:sz w:val="19"/>
+              </w:rPr>
+              <w:t>Se agrega la sección 1.3, Delimitación del MVP, con la lista explícita de lo que el MVP incluye y excluye, en respuesta a la retroalimentación docente.</w:t>
             </w:r>
           </w:p>
         </w:tc>
@@ -1243,7 +1309,7 @@
         <w:rPr>
           <w:sz w:val="21"/>
         </w:rPr>
-        <w:t>. No es un sistema clínico, no gestiona pacientes ni derivaciones y no sustituye el juicio profesional. Las exclusiones explícitas se detallan en la sección 8.</w:t>
+        <w:t>. No es un sistema clínico, no gestiona pacientes ni derivaciones y no sustituye el juicio profesional. La sección 1.3 delimita explícitamente qué incluye y qué excluye el MVP; el fundamento de cada exclusión se detalla en la sección 8.</w:t>
       </w:r>
     </w:p>
     <w:p>
@@ -1251,7 +1317,936 @@
         <w:pStyle w:val="Heading2"/>
       </w:pPr>
       <w:r>
-        <w:t>1.3 Definiciones, acrónimos y abreviaturas</w:t>
+        <w:t>1.3 Delimitación del MVP</w:t>
+      </w:r>
+    </w:p>
+    <w:p>
+      <w:pPr>
+        <w:jc w:val="both"/>
+      </w:pPr>
+      <w:r>
+        <w:rPr>
+          <w:sz w:val="21"/>
+        </w:rPr>
+        <w:t>El MVP es el alcance comprometido para la entrega final (Fase 2.3, 26-11-2026). Esta sección lo delimita de forma explícita: todo lo que no figura en la lista de funcionalidades incluidas queda fuera del MVP, aunque se mencione en otras secciones como trabajo futuro o mejora opcional.</w:t>
+      </w:r>
+    </w:p>
+    <w:p>
+      <w:pPr>
+        <w:pStyle w:val="Heading3"/>
+      </w:pPr>
+      <w:r>
+        <w:t>1.3.1 Incluye en el MVP</w:t>
+      </w:r>
+    </w:p>
+    <w:tbl>
+      <w:tblPr>
+        <w:tblStyle w:val="TableGrid"/>
+        <w:tblW w:type="auto" w:w="0"/>
+        <w:jc w:val="center"/>
+        <w:tblLayout w:type="fixed"/>
+        <w:tblLook w:firstColumn="1" w:firstRow="1" w:lastColumn="0" w:lastRow="0" w:noHBand="0" w:noVBand="1" w:val="04A0"/>
+      </w:tblPr>
+      <w:tblGrid>
+        <w:gridCol w:w="3362"/>
+        <w:gridCol w:w="3362"/>
+        <w:gridCol w:w="3362"/>
+      </w:tblGrid>
+      <w:tr>
+        <w:trPr>
+          <w:tblHeader w:val="true"/>
+        </w:trPr>
+        <w:tc>
+          <w:tcPr>
+            <w:tcW w:type="dxa" w:w="2154"/>
+            <w:shd w:val="clear" w:color="auto" w:fill="1F3B63"/>
+          </w:tcPr>
+          <w:p>
+            <w:pPr>
+              <w:spacing w:before="40" w:after="40"/>
+            </w:pPr>
+            <w:r>
+              <w:rPr>
+                <w:b/>
+                <w:color w:val="FFFFFF"/>
+                <w:sz w:val="18"/>
+              </w:rPr>
+              <w:t>Funcionalidad</w:t>
+            </w:r>
+          </w:p>
+        </w:tc>
+        <w:tc>
+          <w:tcPr>
+            <w:tcW w:type="dxa" w:w="5329"/>
+            <w:shd w:val="clear" w:color="auto" w:fill="1F3B63"/>
+          </w:tcPr>
+          <w:p>
+            <w:pPr>
+              <w:spacing w:before="40" w:after="40"/>
+            </w:pPr>
+            <w:r>
+              <w:rPr>
+                <w:b/>
+                <w:color w:val="FFFFFF"/>
+                <w:sz w:val="18"/>
+              </w:rPr>
+              <w:t>Qué entrega</w:t>
+            </w:r>
+          </w:p>
+        </w:tc>
+        <w:tc>
+          <w:tcPr>
+            <w:tcW w:type="dxa" w:w="2551"/>
+            <w:shd w:val="clear" w:color="auto" w:fill="1F3B63"/>
+          </w:tcPr>
+          <w:p>
+            <w:pPr>
+              <w:spacing w:before="40" w:after="40"/>
+            </w:pPr>
+            <w:r>
+              <w:rPr>
+                <w:b/>
+                <w:color w:val="FFFFFF"/>
+                <w:sz w:val="18"/>
+              </w:rPr>
+              <w:t>Requisitos</w:t>
+            </w:r>
+          </w:p>
+        </w:tc>
+      </w:tr>
+      <w:tr>
+        <w:tc>
+          <w:tcPr>
+            <w:tcW w:type="dxa" w:w="2154"/>
+          </w:tcPr>
+          <w:p>
+            <w:pPr>
+              <w:spacing w:before="40" w:after="40"/>
+            </w:pPr>
+            <w:r>
+              <w:rPr>
+                <w:b/>
+                <w:sz w:val="18"/>
+              </w:rPr>
+              <w:t>Base de datos confiable</w:t>
+            </w:r>
+          </w:p>
+        </w:tc>
+        <w:tc>
+          <w:tcPr>
+            <w:tcW w:type="dxa" w:w="5329"/>
+          </w:tcPr>
+          <w:p>
+            <w:pPr>
+              <w:spacing w:before="40" w:after="40"/>
+            </w:pPr>
+            <w:r>
+              <w:rPr>
+                <w:sz w:val="18"/>
+              </w:rPr>
+              <w:t>Ingesta, normalización y auditoría de calidad de las atenciones de urgencia y los egresos hospitalarios del DEIS, con ejecución reproducible.</w:t>
+            </w:r>
+          </w:p>
+        </w:tc>
+        <w:tc>
+          <w:tcPr>
+            <w:tcW w:type="dxa" w:w="2551"/>
+          </w:tcPr>
+          <w:p>
+            <w:pPr>
+              <w:spacing w:before="40" w:after="40"/>
+            </w:pPr>
+            <w:r>
+              <w:rPr>
+                <w:sz w:val="18"/>
+              </w:rPr>
+              <w:t>RF-ETL-001 a RF-ETL-012; RF-CAL-001 a RF-CAL-009</w:t>
+            </w:r>
+          </w:p>
+        </w:tc>
+      </w:tr>
+      <w:tr>
+        <w:tc>
+          <w:tcPr>
+            <w:tcW w:type="dxa" w:w="2154"/>
+            <w:shd w:val="clear" w:color="auto" w:fill="EAF0F6"/>
+          </w:tcPr>
+          <w:p>
+            <w:pPr>
+              <w:spacing w:before="40" w:after="40"/>
+            </w:pPr>
+            <w:r>
+              <w:rPr>
+                <w:b/>
+                <w:sz w:val="18"/>
+              </w:rPr>
+              <w:t>Proyección de demanda</w:t>
+            </w:r>
+          </w:p>
+        </w:tc>
+        <w:tc>
+          <w:tcPr>
+            <w:tcW w:type="dxa" w:w="5329"/>
+            <w:shd w:val="clear" w:color="auto" w:fill="EAF0F6"/>
+          </w:tcPr>
+          <w:p>
+            <w:pPr>
+              <w:spacing w:before="40" w:after="40"/>
+            </w:pPr>
+            <w:r>
+              <w:rPr>
+                <w:sz w:val="18"/>
+              </w:rPr>
+              <w:t>Pronóstico semanal de atenciones de urgencia en salud mental a 4–8 semanas, para la Región Metropolitana y sus comunas, con intervalos de predicción, backtesting y comparación contra un baseline estacional.</w:t>
+            </w:r>
+          </w:p>
+        </w:tc>
+        <w:tc>
+          <w:tcPr>
+            <w:tcW w:type="dxa" w:w="2551"/>
+            <w:shd w:val="clear" w:color="auto" w:fill="EAF0F6"/>
+          </w:tcPr>
+          <w:p>
+            <w:pPr>
+              <w:spacing w:before="40" w:after="40"/>
+            </w:pPr>
+            <w:r>
+              <w:rPr>
+                <w:sz w:val="18"/>
+              </w:rPr>
+              <w:t>RF-DEM-001 a RF-DEM-009</w:t>
+            </w:r>
+          </w:p>
+        </w:tc>
+      </w:tr>
+      <w:tr>
+        <w:tc>
+          <w:tcPr>
+            <w:tcW w:type="dxa" w:w="2154"/>
+          </w:tcPr>
+          <w:p>
+            <w:pPr>
+              <w:spacing w:before="40" w:after="40"/>
+            </w:pPr>
+            <w:r>
+              <w:rPr>
+                <w:b/>
+                <w:sz w:val="18"/>
+              </w:rPr>
+              <w:t>Análisis territorial</w:t>
+            </w:r>
+          </w:p>
+        </w:tc>
+        <w:tc>
+          <w:tcPr>
+            <w:tcW w:type="dxa" w:w="5329"/>
+          </w:tcPr>
+          <w:p>
+            <w:pPr>
+              <w:spacing w:before="40" w:after="40"/>
+            </w:pPr>
+            <w:r>
+              <w:rPr>
+                <w:sz w:val="18"/>
+              </w:rPr>
+              <w:t>Georreferenciación de la oferta pública de urgencia, isócronas por red vial y transporte público, cobertura poblacional y cruce con vulnerabilidad socioeconómica comunal.</w:t>
+            </w:r>
+          </w:p>
+        </w:tc>
+        <w:tc>
+          <w:tcPr>
+            <w:tcW w:type="dxa" w:w="2551"/>
+          </w:tcPr>
+          <w:p>
+            <w:pPr>
+              <w:spacing w:before="40" w:after="40"/>
+            </w:pPr>
+            <w:r>
+              <w:rPr>
+                <w:sz w:val="18"/>
+              </w:rPr>
+              <w:t>RF-ACC-001 a RF-ACC-006</w:t>
+            </w:r>
+          </w:p>
+        </w:tc>
+      </w:tr>
+      <w:tr>
+        <w:tc>
+          <w:tcPr>
+            <w:tcW w:type="dxa" w:w="2154"/>
+            <w:shd w:val="clear" w:color="auto" w:fill="EAF0F6"/>
+          </w:tcPr>
+          <w:p>
+            <w:pPr>
+              <w:spacing w:before="40" w:after="40"/>
+            </w:pPr>
+            <w:r>
+              <w:rPr>
+                <w:b/>
+                <w:sz w:val="18"/>
+              </w:rPr>
+              <w:t>Caracterización de hospitalizaciones</w:t>
+            </w:r>
+          </w:p>
+        </w:tc>
+        <w:tc>
+          <w:tcPr>
+            <w:tcW w:type="dxa" w:w="5329"/>
+            <w:shd w:val="clear" w:color="auto" w:fill="EAF0F6"/>
+          </w:tcPr>
+          <w:p>
+            <w:pPr>
+              <w:spacing w:before="40" w:after="40"/>
+            </w:pPr>
+            <w:r>
+              <w:rPr>
+                <w:sz w:val="18"/>
+              </w:rPr>
+              <w:t>Duración de estadía de los egresos F00–F99 y sus factores asociados, al menos sexo, previsión y pertenencia del establecimiento al SNSS.</w:t>
+            </w:r>
+          </w:p>
+        </w:tc>
+        <w:tc>
+          <w:tcPr>
+            <w:tcW w:type="dxa" w:w="2551"/>
+            <w:shd w:val="clear" w:color="auto" w:fill="EAF0F6"/>
+          </w:tcPr>
+          <w:p>
+            <w:pPr>
+              <w:spacing w:before="40" w:after="40"/>
+            </w:pPr>
+            <w:r>
+              <w:rPr>
+                <w:sz w:val="18"/>
+              </w:rPr>
+              <w:t>RF-HOS-001 a RF-HOS-006</w:t>
+            </w:r>
+          </w:p>
+        </w:tc>
+      </w:tr>
+      <w:tr>
+        <w:tc>
+          <w:tcPr>
+            <w:tcW w:type="dxa" w:w="2154"/>
+          </w:tcPr>
+          <w:p>
+            <w:pPr>
+              <w:spacing w:before="40" w:after="40"/>
+            </w:pPr>
+            <w:r>
+              <w:rPr>
+                <w:b/>
+                <w:sz w:val="18"/>
+              </w:rPr>
+              <w:t>Visualización de resultados</w:t>
+            </w:r>
+          </w:p>
+        </w:tc>
+        <w:tc>
+          <w:tcPr>
+            <w:tcW w:type="dxa" w:w="5329"/>
+          </w:tcPr>
+          <w:p>
+            <w:pPr>
+              <w:spacing w:before="40" w:after="40"/>
+            </w:pPr>
+            <w:r>
+              <w:rPr>
+                <w:sz w:val="18"/>
+              </w:rPr>
+              <w:t>Plataforma web con series, mapas y tablas de los tres componentes analíticos, con advertencias de interpretación visibles.</w:t>
+            </w:r>
+          </w:p>
+        </w:tc>
+        <w:tc>
+          <w:tcPr>
+            <w:tcW w:type="dxa" w:w="2551"/>
+          </w:tcPr>
+          <w:p>
+            <w:pPr>
+              <w:spacing w:before="40" w:after="40"/>
+            </w:pPr>
+            <w:r>
+              <w:rPr>
+                <w:sz w:val="18"/>
+              </w:rPr>
+              <w:t>RF-VIS-001 a RF-VIS-011</w:t>
+            </w:r>
+          </w:p>
+        </w:tc>
+      </w:tr>
+      <w:tr>
+        <w:tc>
+          <w:tcPr>
+            <w:tcW w:type="dxa" w:w="2154"/>
+            <w:shd w:val="clear" w:color="auto" w:fill="EAF0F6"/>
+          </w:tcPr>
+          <w:p>
+            <w:pPr>
+              <w:spacing w:before="40" w:after="40"/>
+            </w:pPr>
+            <w:r>
+              <w:rPr>
+                <w:b/>
+                <w:sz w:val="18"/>
+              </w:rPr>
+              <w:t>API de consulta</w:t>
+            </w:r>
+          </w:p>
+        </w:tc>
+        <w:tc>
+          <w:tcPr>
+            <w:tcW w:type="dxa" w:w="5329"/>
+            <w:shd w:val="clear" w:color="auto" w:fill="EAF0F6"/>
+          </w:tcPr>
+          <w:p>
+            <w:pPr>
+              <w:spacing w:before="40" w:after="40"/>
+            </w:pPr>
+            <w:r>
+              <w:rPr>
+                <w:sz w:val="18"/>
+              </w:rPr>
+              <w:t>Servicio que expone datos, pronósticos y capas territoriales a la plataforma.</w:t>
+            </w:r>
+          </w:p>
+        </w:tc>
+        <w:tc>
+          <w:tcPr>
+            <w:tcW w:type="dxa" w:w="2551"/>
+            <w:shd w:val="clear" w:color="auto" w:fill="EAF0F6"/>
+          </w:tcPr>
+          <w:p>
+            <w:pPr>
+              <w:spacing w:before="40" w:after="40"/>
+            </w:pPr>
+            <w:r>
+              <w:rPr>
+                <w:sz w:val="18"/>
+              </w:rPr>
+              <w:t>RF-API-001 a RF-API-008</w:t>
+            </w:r>
+          </w:p>
+        </w:tc>
+      </w:tr>
+      <w:tr>
+        <w:tc>
+          <w:tcPr>
+            <w:tcW w:type="dxa" w:w="2154"/>
+          </w:tcPr>
+          <w:p>
+            <w:pPr>
+              <w:spacing w:before="40" w:after="40"/>
+            </w:pPr>
+            <w:r>
+              <w:rPr>
+                <w:b/>
+                <w:sz w:val="18"/>
+              </w:rPr>
+              <w:t>Trazabilidad y administración</w:t>
+            </w:r>
+          </w:p>
+        </w:tc>
+        <w:tc>
+          <w:tcPr>
+            <w:tcW w:type="dxa" w:w="5329"/>
+          </w:tcPr>
+          <w:p>
+            <w:pPr>
+              <w:spacing w:before="40" w:after="40"/>
+            </w:pPr>
+            <w:r>
+              <w:rPr>
+                <w:sz w:val="18"/>
+              </w:rPr>
+              <w:t>Registro de fuentes y versiones de datos, y operación básica de la plataforma.</w:t>
+            </w:r>
+          </w:p>
+        </w:tc>
+        <w:tc>
+          <w:tcPr>
+            <w:tcW w:type="dxa" w:w="2551"/>
+          </w:tcPr>
+          <w:p>
+            <w:pPr>
+              <w:spacing w:before="40" w:after="40"/>
+            </w:pPr>
+            <w:r>
+              <w:rPr>
+                <w:sz w:val="18"/>
+              </w:rPr>
+              <w:t>RF-TRZ-001 a RF-TRZ-003, RF-TRZ-005; RF-ADM-001 a RF-ADM-005, RF-ADM-007</w:t>
+            </w:r>
+          </w:p>
+        </w:tc>
+      </w:tr>
+    </w:tbl>
+    <w:p>
+      <w:pPr>
+        <w:spacing w:after="80"/>
+      </w:pPr>
+    </w:p>
+    <w:p>
+      <w:pPr>
+        <w:pStyle w:val="Heading3"/>
+      </w:pPr>
+      <w:r>
+        <w:t>1.3.2 Fuera del MVP</w:t>
+      </w:r>
+    </w:p>
+    <w:tbl>
+      <w:tblPr>
+        <w:tblStyle w:val="TableGrid"/>
+        <w:tblW w:type="auto" w:w="0"/>
+        <w:jc w:val="center"/>
+        <w:tblLayout w:type="fixed"/>
+        <w:tblLook w:firstColumn="1" w:firstRow="1" w:lastColumn="0" w:lastRow="0" w:noHBand="0" w:noVBand="1" w:val="04A0"/>
+      </w:tblPr>
+      <w:tblGrid>
+        <w:gridCol w:w="3362"/>
+        <w:gridCol w:w="3362"/>
+        <w:gridCol w:w="3362"/>
+      </w:tblGrid>
+      <w:tr>
+        <w:trPr>
+          <w:tblHeader w:val="true"/>
+        </w:trPr>
+        <w:tc>
+          <w:tcPr>
+            <w:tcW w:type="dxa" w:w="2608"/>
+            <w:shd w:val="clear" w:color="auto" w:fill="1F3B63"/>
+          </w:tcPr>
+          <w:p>
+            <w:pPr>
+              <w:spacing w:before="40" w:after="40"/>
+            </w:pPr>
+            <w:r>
+              <w:rPr>
+                <w:b/>
+                <w:color w:val="FFFFFF"/>
+                <w:sz w:val="18"/>
+              </w:rPr>
+              <w:t>Funcionalidad excluida</w:t>
+            </w:r>
+          </w:p>
+        </w:tc>
+        <w:tc>
+          <w:tcPr>
+            <w:tcW w:type="dxa" w:w="5329"/>
+            <w:shd w:val="clear" w:color="auto" w:fill="1F3B63"/>
+          </w:tcPr>
+          <w:p>
+            <w:pPr>
+              <w:spacing w:before="40" w:after="40"/>
+            </w:pPr>
+            <w:r>
+              <w:rPr>
+                <w:b/>
+                <w:color w:val="FFFFFF"/>
+                <w:sz w:val="18"/>
+              </w:rPr>
+              <w:t>Motivo</w:t>
+            </w:r>
+          </w:p>
+        </w:tc>
+        <w:tc>
+          <w:tcPr>
+            <w:tcW w:type="dxa" w:w="2098"/>
+            <w:shd w:val="clear" w:color="auto" w:fill="1F3B63"/>
+          </w:tcPr>
+          <w:p>
+            <w:pPr>
+              <w:spacing w:before="40" w:after="40"/>
+            </w:pPr>
+            <w:r>
+              <w:rPr>
+                <w:b/>
+                <w:color w:val="FFFFFF"/>
+                <w:sz w:val="18"/>
+              </w:rPr>
+              <w:t>Referencia</w:t>
+            </w:r>
+          </w:p>
+        </w:tc>
+      </w:tr>
+      <w:tr>
+        <w:tc>
+          <w:tcPr>
+            <w:tcW w:type="dxa" w:w="2608"/>
+          </w:tcPr>
+          <w:p>
+            <w:pPr>
+              <w:spacing w:before="40" w:after="40"/>
+            </w:pPr>
+            <w:r>
+              <w:rPr>
+                <w:b/>
+                <w:sz w:val="18"/>
+              </w:rPr>
+              <w:t>Gestión de pacientes</w:t>
+            </w:r>
+          </w:p>
+        </w:tc>
+        <w:tc>
+          <w:tcPr>
+            <w:tcW w:type="dxa" w:w="5329"/>
+          </w:tcPr>
+          <w:p>
+            <w:pPr>
+              <w:spacing w:before="40" w:after="40"/>
+            </w:pPr>
+            <w:r>
+              <w:rPr>
+                <w:sz w:val="18"/>
+              </w:rPr>
+              <w:t>El sistema no registra, sigue ni deriva pacientes, ni trata fichas clínicas o datos identificables: trabaja solo con datos agregados o disociados.</w:t>
+            </w:r>
+          </w:p>
+        </w:tc>
+        <w:tc>
+          <w:tcPr>
+            <w:tcW w:type="dxa" w:w="2098"/>
+          </w:tcPr>
+          <w:p>
+            <w:pPr>
+              <w:spacing w:before="40" w:after="40"/>
+            </w:pPr>
+            <w:r>
+              <w:rPr>
+                <w:sz w:val="18"/>
+              </w:rPr>
+              <w:t>FA-02, FA-03</w:t>
+            </w:r>
+          </w:p>
+        </w:tc>
+      </w:tr>
+      <w:tr>
+        <w:tc>
+          <w:tcPr>
+            <w:tcW w:type="dxa" w:w="2608"/>
+            <w:shd w:val="clear" w:color="auto" w:fill="EAF0F6"/>
+          </w:tcPr>
+          <w:p>
+            <w:pPr>
+              <w:spacing w:before="40" w:after="40"/>
+            </w:pPr>
+            <w:r>
+              <w:rPr>
+                <w:b/>
+                <w:sz w:val="18"/>
+              </w:rPr>
+              <w:t>Gestión de cupos o camas en tiempo real</w:t>
+            </w:r>
+          </w:p>
+        </w:tc>
+        <w:tc>
+          <w:tcPr>
+            <w:tcW w:type="dxa" w:w="5329"/>
+            <w:shd w:val="clear" w:color="auto" w:fill="EAF0F6"/>
+          </w:tcPr>
+          <w:p>
+            <w:pPr>
+              <w:spacing w:before="40" w:after="40"/>
+            </w:pPr>
+            <w:r>
+              <w:rPr>
+                <w:sz w:val="18"/>
+              </w:rPr>
+              <w:t>Requiere datos operativos de múltiples instituciones a los que el proyecto no tiene acceso ni autoridad.</w:t>
+            </w:r>
+          </w:p>
+        </w:tc>
+        <w:tc>
+          <w:tcPr>
+            <w:tcW w:type="dxa" w:w="2098"/>
+            <w:shd w:val="clear" w:color="auto" w:fill="EAF0F6"/>
+          </w:tcPr>
+          <w:p>
+            <w:pPr>
+              <w:spacing w:before="40" w:after="40"/>
+            </w:pPr>
+            <w:r>
+              <w:rPr>
+                <w:sz w:val="18"/>
+              </w:rPr>
+              <w:t>FA-01</w:t>
+            </w:r>
+          </w:p>
+        </w:tc>
+      </w:tr>
+      <w:tr>
+        <w:tc>
+          <w:tcPr>
+            <w:tcW w:type="dxa" w:w="2608"/>
+          </w:tcPr>
+          <w:p>
+            <w:pPr>
+              <w:spacing w:before="40" w:after="40"/>
+            </w:pPr>
+            <w:r>
+              <w:rPr>
+                <w:b/>
+                <w:sz w:val="18"/>
+              </w:rPr>
+              <w:t>Decisiones clínicas</w:t>
+            </w:r>
+          </w:p>
+        </w:tc>
+        <w:tc>
+          <w:tcPr>
+            <w:tcW w:type="dxa" w:w="5329"/>
+          </w:tcPr>
+          <w:p>
+            <w:pPr>
+              <w:spacing w:before="40" w:after="40"/>
+            </w:pPr>
+            <w:r>
+              <w:rPr>
+                <w:sz w:val="18"/>
+              </w:rPr>
+              <w:t>No apoya diagnóstico, triage ni decisiones sobre pacientes individuales; es una herramienta de planificación poblacional.</w:t>
+            </w:r>
+          </w:p>
+        </w:tc>
+        <w:tc>
+          <w:tcPr>
+            <w:tcW w:type="dxa" w:w="2098"/>
+          </w:tcPr>
+          <w:p>
+            <w:pPr>
+              <w:spacing w:before="40" w:after="40"/>
+            </w:pPr>
+            <w:r>
+              <w:rPr>
+                <w:sz w:val="18"/>
+              </w:rPr>
+              <w:t>FA-04</w:t>
+            </w:r>
+          </w:p>
+        </w:tc>
+      </w:tr>
+      <w:tr>
+        <w:tc>
+          <w:tcPr>
+            <w:tcW w:type="dxa" w:w="2608"/>
+            <w:shd w:val="clear" w:color="auto" w:fill="EAF0F6"/>
+          </w:tcPr>
+          <w:p>
+            <w:pPr>
+              <w:spacing w:before="40" w:after="40"/>
+            </w:pPr>
+            <w:r>
+              <w:rPr>
+                <w:b/>
+                <w:sz w:val="18"/>
+              </w:rPr>
+              <w:t>Predicción de riesgo individual</w:t>
+            </w:r>
+          </w:p>
+        </w:tc>
+        <w:tc>
+          <w:tcPr>
+            <w:tcW w:type="dxa" w:w="5329"/>
+            <w:shd w:val="clear" w:color="auto" w:fill="EAF0F6"/>
+          </w:tcPr>
+          <w:p>
+            <w:pPr>
+              <w:spacing w:before="40" w:after="40"/>
+            </w:pPr>
+            <w:r>
+              <w:rPr>
+                <w:sz w:val="18"/>
+              </w:rPr>
+              <w:t>Incompatible con la granularidad agregada de los datos y con las restricciones éticas del proyecto.</w:t>
+            </w:r>
+          </w:p>
+        </w:tc>
+        <w:tc>
+          <w:tcPr>
+            <w:tcW w:type="dxa" w:w="2098"/>
+            <w:shd w:val="clear" w:color="auto" w:fill="EAF0F6"/>
+          </w:tcPr>
+          <w:p>
+            <w:pPr>
+              <w:spacing w:before="40" w:after="40"/>
+            </w:pPr>
+            <w:r>
+              <w:rPr>
+                <w:sz w:val="18"/>
+              </w:rPr>
+              <w:t>FA-07</w:t>
+            </w:r>
+          </w:p>
+        </w:tc>
+      </w:tr>
+      <w:tr>
+        <w:tc>
+          <w:tcPr>
+            <w:tcW w:type="dxa" w:w="2608"/>
+          </w:tcPr>
+          <w:p>
+            <w:pPr>
+              <w:spacing w:before="40" w:after="40"/>
+            </w:pPr>
+            <w:r>
+              <w:rPr>
+                <w:b/>
+                <w:sz w:val="18"/>
+              </w:rPr>
+              <w:t>Integración en tiempo real con sistemas hospitalarios</w:t>
+            </w:r>
+          </w:p>
+        </w:tc>
+        <w:tc>
+          <w:tcPr>
+            <w:tcW w:type="dxa" w:w="5329"/>
+          </w:tcPr>
+          <w:p>
+            <w:pPr>
+              <w:spacing w:before="40" w:after="40"/>
+            </w:pPr>
+            <w:r>
+              <w:rPr>
+                <w:sz w:val="18"/>
+              </w:rPr>
+              <w:t>No existe acceso ni convenio institucional dentro del plazo del proyecto.</w:t>
+            </w:r>
+          </w:p>
+        </w:tc>
+        <w:tc>
+          <w:tcPr>
+            <w:tcW w:type="dxa" w:w="2098"/>
+          </w:tcPr>
+          <w:p>
+            <w:pPr>
+              <w:spacing w:before="40" w:after="40"/>
+            </w:pPr>
+            <w:r>
+              <w:rPr>
+                <w:sz w:val="18"/>
+              </w:rPr>
+              <w:t>FA-08</w:t>
+            </w:r>
+          </w:p>
+        </w:tc>
+      </w:tr>
+      <w:tr>
+        <w:tc>
+          <w:tcPr>
+            <w:tcW w:type="dxa" w:w="2608"/>
+            <w:shd w:val="clear" w:color="auto" w:fill="EAF0F6"/>
+          </w:tcPr>
+          <w:p>
+            <w:pPr>
+              <w:spacing w:before="40" w:after="40"/>
+            </w:pPr>
+            <w:r>
+              <w:rPr>
+                <w:b/>
+                <w:sz w:val="18"/>
+              </w:rPr>
+              <w:t>Otras regiones y sector privado</w:t>
+            </w:r>
+          </w:p>
+        </w:tc>
+        <w:tc>
+          <w:tcPr>
+            <w:tcW w:type="dxa" w:w="5329"/>
+            <w:shd w:val="clear" w:color="auto" w:fill="EAF0F6"/>
+          </w:tcPr>
+          <w:p>
+            <w:pPr>
+              <w:spacing w:before="40" w:after="40"/>
+            </w:pPr>
+            <w:r>
+              <w:rPr>
+                <w:sz w:val="18"/>
+              </w:rPr>
+              <w:t>El MVP cubre la Región Metropolitana y la red pública, que son las que tienen fuente oficial equivalente.</w:t>
+            </w:r>
+          </w:p>
+        </w:tc>
+        <w:tc>
+          <w:tcPr>
+            <w:tcW w:type="dxa" w:w="2098"/>
+            <w:shd w:val="clear" w:color="auto" w:fill="EAF0F6"/>
+          </w:tcPr>
+          <w:p>
+            <w:pPr>
+              <w:spacing w:before="40" w:after="40"/>
+            </w:pPr>
+            <w:r>
+              <w:rPr>
+                <w:sz w:val="18"/>
+              </w:rPr>
+              <w:t>FA-05, FA-06</w:t>
+            </w:r>
+          </w:p>
+        </w:tc>
+      </w:tr>
+      <w:tr>
+        <w:tc>
+          <w:tcPr>
+            <w:tcW w:type="dxa" w:w="2608"/>
+          </w:tcPr>
+          <w:p>
+            <w:pPr>
+              <w:spacing w:before="40" w:after="40"/>
+            </w:pPr>
+            <w:r>
+              <w:rPr>
+                <w:b/>
+                <w:sz w:val="18"/>
+              </w:rPr>
+              <w:t>Extensiones opcionales</w:t>
+            </w:r>
+          </w:p>
+        </w:tc>
+        <w:tc>
+          <w:tcPr>
+            <w:tcW w:type="dxa" w:w="5329"/>
+          </w:tcPr>
+          <w:p>
+            <w:pPr>
+              <w:spacing w:before="40" w:after="40"/>
+            </w:pPr>
+            <w:r>
+              <w:rPr>
+                <w:sz w:val="18"/>
+              </w:rPr>
+              <w:t>Reentrenamiento programado, comparación de escenarios, desagregación por subcausa, exportación de capas y demás mejoras del incremento I4: se desarrollan solo si el avance lo permite y no condicionan la entrega.</w:t>
+            </w:r>
+          </w:p>
+        </w:tc>
+        <w:tc>
+          <w:tcPr>
+            <w:tcW w:type="dxa" w:w="2098"/>
+          </w:tcPr>
+          <w:p>
+            <w:pPr>
+              <w:spacing w:before="40" w:after="40"/>
+            </w:pPr>
+            <w:r>
+              <w:rPr>
+                <w:sz w:val="18"/>
+              </w:rPr>
+              <w:t>Sección 10, incremento I4</w:t>
+            </w:r>
+          </w:p>
+        </w:tc>
+      </w:tr>
+    </w:tbl>
+    <w:p>
+      <w:pPr>
+        <w:spacing w:after="80"/>
+      </w:pPr>
+    </w:p>
+    <w:p>
+      <w:pPr>
+        <w:pStyle w:val="Heading2"/>
+      </w:pPr>
+      <w:r>
+        <w:t>1.4 Definiciones, acrónimos y abreviaturas</w:t>
       </w:r>
     </w:p>
     <w:tbl>
@@ -1958,7 +2953,7 @@
         <w:pStyle w:val="Heading2"/>
       </w:pPr>
       <w:r>
-        <w:t>1.4 Referencias</w:t>
+        <w:t>1.5 Referencias</w:t>
       </w:r>
     </w:p>
     <w:tbl>
@@ -2603,7 +3598,7 @@
         <w:pStyle w:val="Heading2"/>
       </w:pPr>
       <w:r>
-        <w:t>1.5 Estructura del documento</w:t>
+        <w:t>1.6 Estructura del documento</w:t>
       </w:r>
     </w:p>
     <w:p>
@@ -2614,7 +3609,7 @@
         <w:rPr>
           <w:sz w:val="21"/>
         </w:rPr>
-        <w:t>La sección 2 describe el contexto, los actores y las restricciones generales. La sección 3 fija las convenciones de identificación, prioridad y verificación. La sección 4 contiene el catálogo de requisitos funcionales, organizado en nueve módulos. Las secciones 5 y 6 expresan esos mismos requisitos desde la perspectiva del usuario, mediante historias de usuario y casos de uso. Las secciones 7 y 8 delimitan las reglas de negocio y las exclusiones. Las secciones 9 a 12 aseguran trazabilidad, planificación por incrementos, criterios de aceptación global y control de cambios.</w:t>
+        <w:t>La sección 1.3 delimita qué incluye y qué excluye el MVP. La sección 2 describe el contexto, los actores y las restricciones generales. La sección 3 fija las convenciones de identificación, prioridad y verificación. La sección 4 contiene el catálogo de requisitos funcionales, organizado en nueve módulos. Las secciones 5 y 6 expresan esos mismos requisitos desde la perspectiva del usuario, mediante historias de usuario y casos de uso. Las secciones 7 y 8 delimitan las reglas de negocio y las exclusiones. Las secciones 9 a 12 aseguran trazabilidad, planificación por incrementos, criterios de aceptación global y control de cambios.</w:t>
       </w:r>
     </w:p>
     <w:p>
@@ -19830,7 +20825,7 @@
         <w:color w:val="595959"/>
         <w:sz w:val="16"/>
       </w:rPr>
-      <w:t xml:space="preserve">ERF-SAAD-2026 · Especificación de Requisitos Funcionales · v1.0  |  Página </w:t>
+      <w:t xml:space="preserve">ERF-SAAD-2026 · Especificación de Requisitos Funcionales · v1.1  |  Página </w:t>
     </w:r>
     <w:r>
       <w:rPr>

</xml_diff>